<commit_message>
Add HR module implementation with employee management, uniform inventory, and audit trail tracking
</commit_message>
<xml_diff>
--- a/public/assets/generatePDF/template_accountability.docx
+++ b/public/assets/generatePDF/template_accountability.docx
@@ -220,7 +220,6 @@
                 <w:color w:val="193989"/>
               </w:rPr>
             </w:pPr>
-            <w:proofErr w:type="gramStart"/>
             <w:r>
               <w:rPr>
                 <w:rFonts w:ascii="Poppins" w:eastAsia="Poppins" w:hAnsi="Poppins" w:cs="Poppins"/>
@@ -228,7 +227,6 @@
               </w:rPr>
               <w:t>Employee  Position</w:t>
             </w:r>
-            <w:proofErr w:type="gramEnd"/>
           </w:p>
         </w:tc>
         <w:tc>
@@ -323,29 +321,7 @@
                 <w:sz w:val="20"/>
                 <w:szCs w:val="20"/>
               </w:rPr>
-              <w:t>${</w:t>
-            </w:r>
-            <w:proofErr w:type="spellStart"/>
-            <w:r>
-              <w:rPr>
-                <w:rFonts w:ascii="Poppins" w:eastAsia="Poppins" w:hAnsi="Poppins" w:cs="Poppins"/>
-                <w:b/>
-                <w:color w:val="193989"/>
-                <w:sz w:val="20"/>
-                <w:szCs w:val="20"/>
-              </w:rPr>
-              <w:t>employee_id</w:t>
-            </w:r>
-            <w:proofErr w:type="spellEnd"/>
-            <w:r>
-              <w:rPr>
-                <w:rFonts w:ascii="Poppins" w:eastAsia="Poppins" w:hAnsi="Poppins" w:cs="Poppins"/>
-                <w:b/>
-                <w:color w:val="193989"/>
-                <w:sz w:val="20"/>
-                <w:szCs w:val="20"/>
-              </w:rPr>
-              <w:t>}</w:t>
+              <w:t>${employee_id}</w:t>
             </w:r>
           </w:p>
         </w:tc>
@@ -445,47 +421,7 @@
           <w:sz w:val="20"/>
           <w:szCs w:val="20"/>
         </w:rPr>
-        <w:t xml:space="preserve">If I quit without notice, I agree </w:t>
-      </w:r>
-      <w:proofErr w:type="gramStart"/>
-      <w:r>
-        <w:rPr>
-          <w:rFonts w:ascii="Poppins" w:eastAsia="Poppins" w:hAnsi="Poppins" w:cs="Poppins"/>
-          <w:color w:val="193989"/>
-          <w:sz w:val="20"/>
-          <w:szCs w:val="20"/>
-        </w:rPr>
-        <w:t>to  still</w:t>
-      </w:r>
-      <w:proofErr w:type="gramEnd"/>
-      <w:r>
-        <w:rPr>
-          <w:rFonts w:ascii="Poppins" w:eastAsia="Poppins" w:hAnsi="Poppins" w:cs="Poppins"/>
-          <w:color w:val="193989"/>
-          <w:sz w:val="20"/>
-          <w:szCs w:val="20"/>
-        </w:rPr>
-        <w:t xml:space="preserve"> return all company property within 24 hours of my last day. If the property is not returned </w:t>
-      </w:r>
-      <w:proofErr w:type="gramStart"/>
-      <w:r>
-        <w:rPr>
-          <w:rFonts w:ascii="Poppins" w:eastAsia="Poppins" w:hAnsi="Poppins" w:cs="Poppins"/>
-          <w:color w:val="193989"/>
-          <w:sz w:val="20"/>
-          <w:szCs w:val="20"/>
-        </w:rPr>
-        <w:t>within  the</w:t>
-      </w:r>
-      <w:proofErr w:type="gramEnd"/>
-      <w:r>
-        <w:rPr>
-          <w:rFonts w:ascii="Poppins" w:eastAsia="Poppins" w:hAnsi="Poppins" w:cs="Poppins"/>
-          <w:color w:val="193989"/>
-          <w:sz w:val="20"/>
-          <w:szCs w:val="20"/>
-        </w:rPr>
-        <w:t xml:space="preserve"> given time period, I understand that the company properties will be considered as stolen properties and will be turned over to the police.</w:t>
+        <w:t>If I quit without notice, I agree to  still return all company property within 24 hours of my last day. If the property is not returned within  the given time period, I understand that the company properties will be considered as stolen properties and will be turned over to the police.</w:t>
       </w:r>
     </w:p>
     <w:p>
@@ -704,6 +640,157 @@
             <w:tcBorders>
               <w:top w:val="single" w:sz="12" w:space="0" w:color="193989"/>
               <w:left w:val="single" w:sz="12" w:space="0" w:color="193989"/>
+              <w:bottom w:val="single" w:sz="12" w:space="0" w:color="193989"/>
+              <w:right w:val="single" w:sz="12" w:space="0" w:color="193989"/>
+            </w:tcBorders>
+            <w:vAlign w:val="center"/>
+          </w:tcPr>
+          <w:p>
+            <w:pPr>
+              <w:ind w:left="0"/>
+              <w:rPr>
+                <w:rFonts w:ascii="Poppins" w:eastAsia="Poppins" w:hAnsi="Poppins" w:cs="Poppins"/>
+                <w:color w:val="193989"/>
+                <w:sz w:val="18"/>
+                <w:szCs w:val="18"/>
+              </w:rPr>
+            </w:pPr>
+            <w:r>
+              <w:rPr>
+                <w:rFonts w:ascii="Poppins" w:eastAsia="Poppins" w:hAnsi="Poppins" w:cs="Poppins"/>
+                <w:color w:val="193989"/>
+                <w:sz w:val="18"/>
+                <w:szCs w:val="18"/>
+              </w:rPr>
+              <w:t>${dateissued}</w:t>
+            </w:r>
+          </w:p>
+        </w:tc>
+        <w:tc>
+          <w:tcPr>
+            <w:tcW w:w="3450" w:type="dxa"/>
+            <w:tcBorders>
+              <w:top w:val="single" w:sz="12" w:space="0" w:color="193989"/>
+              <w:left w:val="single" w:sz="12" w:space="0" w:color="193989"/>
+              <w:bottom w:val="single" w:sz="12" w:space="0" w:color="193989"/>
+              <w:right w:val="single" w:sz="12" w:space="0" w:color="193989"/>
+            </w:tcBorders>
+            <w:vAlign w:val="center"/>
+          </w:tcPr>
+          <w:p>
+            <w:pPr>
+              <w:ind w:left="0"/>
+              <w:jc w:val="center"/>
+              <w:rPr>
+                <w:rFonts w:ascii="Poppins" w:eastAsia="Poppins" w:hAnsi="Poppins" w:cs="Poppins"/>
+                <w:color w:val="193989"/>
+              </w:rPr>
+            </w:pPr>
+            <w:r>
+              <w:rPr>
+                <w:rFonts w:ascii="Poppins" w:eastAsia="Poppins" w:hAnsi="Poppins" w:cs="Poppins"/>
+                <w:color w:val="193989"/>
+              </w:rPr>
+              <w:t>${itemInfo}</w:t>
+            </w:r>
+          </w:p>
+        </w:tc>
+        <w:tc>
+          <w:tcPr>
+            <w:tcW w:w="1440" w:type="dxa"/>
+            <w:tcBorders>
+              <w:top w:val="single" w:sz="12" w:space="0" w:color="193989"/>
+              <w:left w:val="single" w:sz="12" w:space="0" w:color="193989"/>
+              <w:bottom w:val="single" w:sz="12" w:space="0" w:color="193989"/>
+              <w:right w:val="single" w:sz="12" w:space="0" w:color="193989"/>
+            </w:tcBorders>
+            <w:vAlign w:val="center"/>
+          </w:tcPr>
+          <w:p>
+            <w:pPr>
+              <w:ind w:left="0"/>
+              <w:jc w:val="center"/>
+              <w:rPr>
+                <w:rFonts w:ascii="Poppins" w:eastAsia="Poppins" w:hAnsi="Poppins" w:cs="Poppins"/>
+                <w:color w:val="193989"/>
+              </w:rPr>
+            </w:pPr>
+            <w:r>
+              <w:rPr>
+                <w:rFonts w:ascii="Poppins" w:eastAsia="Poppins" w:hAnsi="Poppins" w:cs="Poppins"/>
+                <w:color w:val="193989"/>
+              </w:rPr>
+              <w:t>${createdby}</w:t>
+            </w:r>
+          </w:p>
+        </w:tc>
+        <w:tc>
+          <w:tcPr>
+            <w:tcW w:w="1335" w:type="dxa"/>
+            <w:tcBorders>
+              <w:top w:val="single" w:sz="12" w:space="0" w:color="193989"/>
+              <w:left w:val="single" w:sz="12" w:space="0" w:color="193989"/>
+              <w:bottom w:val="single" w:sz="12" w:space="0" w:color="193989"/>
+              <w:right w:val="single" w:sz="12" w:space="0" w:color="193989"/>
+            </w:tcBorders>
+            <w:vAlign w:val="center"/>
+          </w:tcPr>
+          <w:p>
+            <w:pPr>
+              <w:ind w:left="0"/>
+              <w:rPr>
+                <w:rFonts w:ascii="Poppins" w:eastAsia="Poppins" w:hAnsi="Poppins" w:cs="Poppins"/>
+                <w:color w:val="193989"/>
+                <w:sz w:val="18"/>
+                <w:szCs w:val="18"/>
+              </w:rPr>
+            </w:pPr>
+            <w:r>
+              <w:rPr>
+                <w:rFonts w:ascii="Poppins" w:eastAsia="Poppins" w:hAnsi="Poppins" w:cs="Poppins"/>
+                <w:color w:val="193989"/>
+                <w:sz w:val="18"/>
+                <w:szCs w:val="18"/>
+              </w:rPr>
+              <w:t>${dateReturned}</w:t>
+            </w:r>
+          </w:p>
+        </w:tc>
+        <w:tc>
+          <w:tcPr>
+            <w:tcW w:w="1395" w:type="dxa"/>
+            <w:tcBorders>
+              <w:top w:val="single" w:sz="12" w:space="0" w:color="193989"/>
+              <w:left w:val="single" w:sz="12" w:space="0" w:color="193989"/>
+              <w:bottom w:val="single" w:sz="12" w:space="0" w:color="193989"/>
+              <w:right w:val="single" w:sz="12" w:space="0" w:color="193989"/>
+            </w:tcBorders>
+            <w:vAlign w:val="center"/>
+          </w:tcPr>
+          <w:p>
+            <w:pPr>
+              <w:ind w:left="0"/>
+              <w:rPr>
+                <w:rFonts w:ascii="Poppins" w:eastAsia="Poppins" w:hAnsi="Poppins" w:cs="Poppins"/>
+                <w:color w:val="193989"/>
+                <w:sz w:val="26"/>
+                <w:szCs w:val="26"/>
+              </w:rPr>
+            </w:pPr>
+          </w:p>
+        </w:tc>
+      </w:tr>
+      <w:tr>
+        <w:trPr>
+          <w:trHeight w:val="432"/>
+          <w:jc w:val="center"/>
+        </w:trPr>
+        <w:tc>
+          <w:tcPr>
+            <w:tcW w:w="1380" w:type="dxa"/>
+            <w:tcBorders>
+              <w:top w:val="single" w:sz="12" w:space="0" w:color="193989"/>
+              <w:left w:val="single" w:sz="12" w:space="0" w:color="193989"/>
               <w:bottom w:val="single" w:sz="4" w:space="0" w:color="193989"/>
               <w:right w:val="single" w:sz="12" w:space="0" w:color="193989"/>
             </w:tcBorders>
@@ -726,27 +813,7 @@
                 <w:sz w:val="18"/>
                 <w:szCs w:val="18"/>
               </w:rPr>
-              <w:t>${</w:t>
-            </w:r>
-            <w:proofErr w:type="spellStart"/>
-            <w:r>
-              <w:rPr>
-                <w:rFonts w:ascii="Poppins" w:eastAsia="Poppins" w:hAnsi="Poppins" w:cs="Poppins"/>
-                <w:color w:val="193989"/>
-                <w:sz w:val="18"/>
-                <w:szCs w:val="18"/>
-              </w:rPr>
-              <w:t>dateissued</w:t>
-            </w:r>
-            <w:proofErr w:type="spellEnd"/>
-            <w:r>
-              <w:rPr>
-                <w:rFonts w:ascii="Poppins" w:eastAsia="Poppins" w:hAnsi="Poppins" w:cs="Poppins"/>
-                <w:color w:val="193989"/>
-                <w:sz w:val="18"/>
-                <w:szCs w:val="18"/>
-              </w:rPr>
-              <w:t>}</w:t>
+              <w:t>${dateissued}</w:t>
             </w:r>
           </w:p>
         </w:tc>
@@ -775,23 +842,58 @@
                 <w:rFonts w:ascii="Poppins" w:eastAsia="Poppins" w:hAnsi="Poppins" w:cs="Poppins"/>
                 <w:color w:val="193989"/>
               </w:rPr>
-              <w:t>${</w:t>
-            </w:r>
-            <w:proofErr w:type="spellStart"/>
-            <w:r>
-              <w:rPr>
-                <w:rFonts w:ascii="Poppins" w:eastAsia="Poppins" w:hAnsi="Poppins" w:cs="Poppins"/>
-                <w:color w:val="193989"/>
-              </w:rPr>
-              <w:t>itemInfo</w:t>
-            </w:r>
-            <w:proofErr w:type="spellEnd"/>
-            <w:r>
-              <w:rPr>
-                <w:rFonts w:ascii="Poppins" w:eastAsia="Poppins" w:hAnsi="Poppins" w:cs="Poppins"/>
-                <w:color w:val="193989"/>
-              </w:rPr>
-              <w:t>}</w:t>
+              <w:t>${uniform_type}</w:t>
+            </w:r>
+          </w:p>
+          <w:p>
+            <w:pPr>
+              <w:ind w:left="0"/>
+              <w:jc w:val="center"/>
+              <w:rPr>
+                <w:rFonts w:ascii="Poppins" w:eastAsia="Poppins" w:hAnsi="Poppins" w:cs="Poppins"/>
+                <w:color w:val="193989"/>
+              </w:rPr>
+            </w:pPr>
+            <w:r>
+              <w:rPr>
+                <w:rFonts w:ascii="Poppins" w:eastAsia="Poppins" w:hAnsi="Poppins" w:cs="Poppins"/>
+                <w:color w:val="193989"/>
+              </w:rPr>
+              <w:t>${size}</w:t>
+            </w:r>
+          </w:p>
+          <w:p>
+            <w:pPr>
+              <w:ind w:left="0"/>
+              <w:jc w:val="center"/>
+              <w:rPr>
+                <w:rFonts w:ascii="Poppins" w:eastAsia="Poppins" w:hAnsi="Poppins" w:cs="Poppins"/>
+                <w:color w:val="193989"/>
+              </w:rPr>
+            </w:pPr>
+            <w:r>
+              <w:rPr>
+                <w:rFonts w:ascii="Poppins" w:eastAsia="Poppins" w:hAnsi="Poppins" w:cs="Poppins"/>
+                <w:color w:val="193989"/>
+              </w:rPr>
+              <w:t>${color}</w:t>
+            </w:r>
+          </w:p>
+          <w:p>
+            <w:pPr>
+              <w:ind w:left="0"/>
+              <w:jc w:val="center"/>
+              <w:rPr>
+                <w:rFonts w:ascii="Poppins" w:eastAsia="Poppins" w:hAnsi="Poppins" w:cs="Poppins"/>
+                <w:color w:val="193989"/>
+              </w:rPr>
+            </w:pPr>
+            <w:r>
+              <w:rPr>
+                <w:rFonts w:ascii="Poppins" w:eastAsia="Poppins" w:hAnsi="Poppins" w:cs="Poppins"/>
+                <w:color w:val="193989"/>
+              </w:rPr>
+              <w:t>${quantity_issued}</w:t>
             </w:r>
           </w:p>
         </w:tc>
@@ -820,23 +922,7 @@
                 <w:rFonts w:ascii="Poppins" w:eastAsia="Poppins" w:hAnsi="Poppins" w:cs="Poppins"/>
                 <w:color w:val="193989"/>
               </w:rPr>
-              <w:t>${</w:t>
-            </w:r>
-            <w:proofErr w:type="spellStart"/>
-            <w:r>
-              <w:rPr>
-                <w:rFonts w:ascii="Poppins" w:eastAsia="Poppins" w:hAnsi="Poppins" w:cs="Poppins"/>
-                <w:color w:val="193989"/>
-              </w:rPr>
-              <w:t>createdby</w:t>
-            </w:r>
-            <w:proofErr w:type="spellEnd"/>
-            <w:r>
-              <w:rPr>
-                <w:rFonts w:ascii="Poppins" w:eastAsia="Poppins" w:hAnsi="Poppins" w:cs="Poppins"/>
-                <w:color w:val="193989"/>
-              </w:rPr>
-              <w:t>}</w:t>
+              <w:t>${createdby}</w:t>
             </w:r>
           </w:p>
         </w:tc>
@@ -868,27 +954,7 @@
                 <w:sz w:val="18"/>
                 <w:szCs w:val="18"/>
               </w:rPr>
-              <w:t>${</w:t>
-            </w:r>
-            <w:proofErr w:type="spellStart"/>
-            <w:r>
-              <w:rPr>
-                <w:rFonts w:ascii="Poppins" w:eastAsia="Poppins" w:hAnsi="Poppins" w:cs="Poppins"/>
-                <w:color w:val="193989"/>
-                <w:sz w:val="18"/>
-                <w:szCs w:val="18"/>
-              </w:rPr>
-              <w:t>dateReturned</w:t>
-            </w:r>
-            <w:proofErr w:type="spellEnd"/>
-            <w:r>
-              <w:rPr>
-                <w:rFonts w:ascii="Poppins" w:eastAsia="Poppins" w:hAnsi="Poppins" w:cs="Poppins"/>
-                <w:color w:val="193989"/>
-                <w:sz w:val="18"/>
-                <w:szCs w:val="18"/>
-              </w:rPr>
-              <w:t>}</w:t>
+              <w:t>${dateReturned}</w:t>
             </w:r>
           </w:p>
         </w:tc>

</xml_diff>